<commit_message>
WIP: brand enrichment BR4 and fifth brand slice BR5 complete
Co-Authored-By: Claude Opus 5.5 <noreply@anthropic.com>
Claude-Session: https://claude.ai/code/session_013MBxAnfqfvPic4MH55A22V
</commit_message>
<xml_diff>
--- a/desk-drop/desk-drop-legal-pack/rendered/03-office-participation-agreement.docx
+++ b/desk-drop/desk-drop-legal-pack/rendered/03-office-participation-agreement.docx
@@ -64,7 +64,7 @@
         <w:t xml:space="preserve">Company</w:t>
       </w:r>
       <w:r>
-        <w:t xml:space="preserve">") and the office below ("</w:t>
+        <w:t xml:space="preserve">") and the office named below ("</w:t>
       </w:r>
       <w:r>
         <w:rPr>
@@ -74,7 +74,7 @@
         <w:t xml:space="preserve">you</w:t>
       </w:r>
       <w:r>
-        <w:t xml:space="preserve">"). Version 0.5.</w:t>
+        <w:t xml:space="preserve">"). Version 0.6.</w:t>
       </w:r>
     </w:p>
     <w:p>
@@ -140,7 +140,7 @@
                 <w:bCs/>
                 <w:b/>
               </w:rPr>
-              <w:t xml:space="preserve">Company and office address, floor</w:t>
+              <w:t xml:space="preserve">Office (your company's legal name), address, floor</w:t>
             </w:r>
           </w:p>
         </w:tc>
@@ -152,7 +152,7 @@
               <w:jc w:val="left"/>
             </w:pPr>
             <w:r>
-              <w:t xml:space="preserve">[COMPANY] · [OFFICE ADDRESS], [FLOOR OR SUITE]</w:t>
+              <w:t xml:space="preserve">[OFFICE LEGAL NAME] · [OFFICE ADDRESS], [FLOOR OR SUITE]</w:t>
             </w:r>
           </w:p>
         </w:tc>
@@ -293,7 +293,7 @@
         <w:t xml:space="preserve"> </w:t>
       </w:r>
       <w:r>
-        <w:t xml:space="preserve">Products from vetted emerging snack and drink brands, free, roughly monthly as brands are available (no set schedule). Each drop arrives on a Tuesday or Wednesday morning inside your receiving window, with a display card. After each drop we send you a summary of your team's feedback. We add to your pantry; we don't replace your current supplier.</w:t>
+        <w:t xml:space="preserve">Products from vetted emerging snack and drink brands, free, roughly monthly as brands are available (no set schedule). Each drop comes on a Tuesday or Wednesday morning in your receiving window, with a display card. After each drop we send you a summary of your team's feedback. We add to your pantry; we don't replace your supplier.</w:t>
       </w:r>
     </w:p>
     <w:p>
@@ -329,7 +329,7 @@
         <w:t xml:space="preserve"> </w:t>
       </w:r>
       <w:r>
-        <w:t xml:space="preserve">Put it on the shelf within one business day of delivery. Send us one photo of it on the shelf, and one more on day 3 or day 5. Post the survey link once in Slack or by email. Help us reach five or more survey responses (no one has to answer). Give us a ten-minute debrief after the drop. Tell us how many people are usually in on a Tuesday.</w:t>
+        <w:t xml:space="preserve">Put it on the shelf within one business day of delivery. Send us one photo of it on the shelf, and one more on day 3 or day 5. Post the survey link once in Slack or by email. Help us reach five or more survey responses (no one has to answer). Give us a ten-minute debrief after the drop. Tell us your usual Tuesday headcount.</w:t>
       </w:r>
     </w:p>
     <w:p>
@@ -533,7 +533,7 @@
               <w:jc w:val="left"/>
             </w:pPr>
             <w:r>
-              <w:t xml:space="preserve">[NAME], [TITLE]</w:t>
+              <w:t xml:space="preserve">[NAME], [TITLE], for [OFFICE LEGAL NAME]</w:t>
             </w:r>
           </w:p>
         </w:tc>

</xml_diff>

<commit_message>
Legal and admin pack (G): three review rounds complete
Thirteen numbered drafts for attorney review, figures.csv with dated
sources, name-check log, and review rounds 1-3 with builder responses.

Co-Authored-By: Claude Opus 5.5 <noreply@anthropic.com>
Claude-Session: https://claude.ai/code/session_013MBxAnfqfvPic4MH55A22V
</commit_message>
<xml_diff>
--- a/desk-drop/desk-drop-legal-pack/rendered/03-office-participation-agreement.docx
+++ b/desk-drop/desk-drop-legal-pack/rendered/03-office-participation-agreement.docx
@@ -74,7 +74,7 @@
         <w:t xml:space="preserve">you</w:t>
       </w:r>
       <w:r>
-        <w:t xml:space="preserve">"). Version 0.6.</w:t>
+        <w:t xml:space="preserve">"). Version 0.8.</w:t>
       </w:r>
     </w:p>
     <w:p>
@@ -92,7 +92,7 @@
         <w:t xml:space="preserve"> </w:t>
       </w:r>
       <w:r>
-        <w:t xml:space="preserve">free products, nothing to pay, no penalties, no employee data, and either side can stop on a week's notice.</w:t>
+        <w:t xml:space="preserve">free products, nothing to pay, no penalties, nothing asked about your employees, and either side can stop on a week's notice.</w:t>
       </w:r>
     </w:p>
     <w:tbl>
@@ -293,7 +293,7 @@
         <w:t xml:space="preserve"> </w:t>
       </w:r>
       <w:r>
-        <w:t xml:space="preserve">Products from vetted emerging snack and drink brands, free, roughly monthly as brands are available (no set schedule). Each drop comes on a Tuesday or Wednesday morning in your receiving window, with a display card. After each drop we send you a summary of your team's feedback. We add to your pantry; we don't replace your supplier.</w:t>
+        <w:t xml:space="preserve">Products from vetted emerging snack and drink brands, free, roughly monthly as available. Each drop comes on a Tuesday or Wednesday morning in your receiving window, with a display card. After each drop we send you a summary of your team's feedback. We add to your pantry; we don't replace your supplier.</w:t>
       </w:r>
     </w:p>
     <w:p>
@@ -329,7 +329,7 @@
         <w:t xml:space="preserve"> </w:t>
       </w:r>
       <w:r>
-        <w:t xml:space="preserve">Put it on the shelf within one business day of delivery. Send us one photo of it on the shelf, and one more on day 3 or day 5. Post the survey link once in Slack or by email. Help us reach five or more survey responses (no one has to answer). Give us a ten-minute debrief after the drop. Tell us your usual Tuesday headcount.</w:t>
+        <w:t xml:space="preserve">Put it on the shelf at eye level, card in front, within one business day of delivery. Send us one photo of it there the day you place it, and one more on day 3 or day 5. Post the survey link once in Slack or by email. Help us reach five or more survey responses (no one has to answer). Give us a ten-minute debrief after the drop. Tell us your usual Tuesday headcount.</w:t>
       </w:r>
     </w:p>
     <w:p>
@@ -365,7 +365,7 @@
         <w:t xml:space="preserve"> </w:t>
       </w:r>
       <w:r>
-        <w:t xml:space="preserve">Employees take products only if they want to, and we will not hold you responsible for how anyone uses them. If anyone reports a problem with a product, tell us: we remove it from your pantry right away and tell the brand the same day. We collect no personal data about your employees, except an email address an employee chooses to give for a brand's newsletter. Otherwise the survey is anonymous.</w:t>
+        <w:t xml:space="preserve">Employees take products only if they want to, and we will not hold you responsible for how anyone uses them. If anyone reports a problem with a product, tell us: we remove it from your pantry right away and tell the brand the same day. If a brand recalls a product, we tell you that day and collect what is left. We collect no personal data about your employees, except an email address an employee chooses to give for a brand's newsletter. Otherwise the survey is anonymous.</w:t>
       </w:r>
     </w:p>
     <w:p>
@@ -383,7 +383,7 @@
         <w:t xml:space="preserve"> </w:t>
       </w:r>
       <w:r>
-        <w:t xml:space="preserve">We photograph only the shelf and display (never people, screens or whiteboards). We may share those photos with brands, and use them in our own materials without anything that identifies your office. We give a brand your company name and address only after it signs with us, only to run its campaign. Our agreement with the brand requires it to keep them confidential and not to approach you to arrange placements directly for six months. Anywhere else, we name you only if you tick a box here: ☐ on our founding roster, which brands see ☐ publicly, for example on our website.</w:t>
+        <w:t xml:space="preserve">We photograph only the shelf and display (never people, screens or whiteboards). We may share them with brands and use them in our own materials without anything that identifies your office. We give a brand your company name and address only after it signs with us, only to run its campaign. Our agreement with the brand requires it to keep them confidential and not to approach you for direct placements for six months. Anywhere else, we name you only if you tick a box here: ☐ on our founding roster, which brands see ☐ publicly, such as our website.</w:t>
       </w:r>
     </w:p>
     <w:p>

</xml_diff>